<commit_message>
bim-v13: note impression universelle + email pied + numeros PERSONNELS
</commit_message>
<xml_diff>
--- a/LISTE DE PRÉSENCE.docx
+++ b/LISTE DE PRÉSENCE.docx
@@ -4909,7 +4909,7 @@
           <w:sz w:val="16"/>
           <w:szCs w:val="16"/>
         </w:rPr>
-        <w:t>greeninnovatives46@gmail.com</w:t>
+        <w:t>infos@green-innovatives.com</w:t>
       </w:r>
     </w:hyperlink>
     <w:r>
@@ -5047,7 +5047,7 @@
           <w:sz w:val="16"/>
           <w:szCs w:val="16"/>
         </w:rPr>
-        <w:t>greeninnovatives46@gmail.com</w:t>
+        <w:t>infos@green-innovatives.com</w:t>
       </w:r>
     </w:hyperlink>
     <w:r>

</xml_diff>